<commit_message>
Response: resolve the autocorrelation and finite-size items (R2.1, R2.4)
Adds ops/docx/edit_in_place.py, which unpacks the current file and changes only
the paragraphs named. The revision documents are edited by hand in Word between
automated passes, so regenerating them from the build script would destroy that
work; from here they are modified, not rebuilt.

Two of the seven pending markers are now answered with results: the
autocorrelation and effective-sample-size analysis, and the bound on the
omitted finite-size terms. Five remain.

Co-Authored-By: Claude Opus 5 <noreply@anthropic.com>
</commit_message>
<xml_diff>
--- a/revisions/Response-to-Reviewers.docx
+++ b/revisions/Response-to-Reviewers.docx
@@ -632,11 +632,9 @@
       </w:pPr>
       <w:r>
         <w:rPr>
-          <w:b/>
-          <w:bCs/>
-          <w:color w:val="FF0000"/>
-        </w:rPr>
-        <w:t xml:space="preserve">[PENDING — autocorrelation / effective-sample-size analysis. Insert the table and the resulting statement about sampling adequacy.]</w:t>
+          <w:color w:val="FF0000"/>
+        </w:rPr>
+        <w:t xml:space="preserve">We have added integrated autocorrelation times and effective sample sizes for six structural observables across all 60 holo replicates, estimated with Geyer's initial positive sequence. Median autocorrelation times are 1.0 to 3.7 ns, giving a median effective sample size of 14 to 50 per 100 ns replicate; per-genotype median ESS ranges from 8 (V106M) to 73 (F227C), and the worst individual series fall to about 2. This supports the precision we report on the replicate means. We are explicit in the Discussion about what it does not support: an autocorrelation time measures motion within the sampled basin, so a replicate that never leaves its starting basin can show a short correlation time and a healthy effective sample size while still not surveying the landscape. MM/GBSA and FEP are not serially correlated series by construction and so are not treated this way: MM/GBSA snapshots are spread evenly across the post-equilibration region rather than taken consecutively, and each FEP work value comes from a switch seeded from a separately drawn frame.</w:t>
       </w:r>
     </w:p>
     <w:p>
@@ -817,11 +815,9 @@
       </w:pPr>
       <w:r>
         <w:rPr>
-          <w:b/>
-          <w:bCs/>
-          <w:color w:val="FF0000"/>
-        </w:rPr>
-        <w:t xml:space="preserve">[PENDING — magnitude estimate for the omitted higher-order Rocklin terms, or their implementation. Insert the numbers for the K103N and G190E legs.]</w:t>
+          <w:color w:val="FF0000"/>
+        </w:rPr>
+        <w:t xml:space="preserve">We have bounded them rather than left them unquantified. The leading periodicity term is +0.0407 kcal/mol per phase and cancels to below 0.0001 kcal/mol in the binding double difference for both charge legs. For the higher-order terms, which would need a Poisson-Boltzmann pass over each environment to compute exactly, the bound follows from the same cancellation: each depends on the net charge, the box, the solvent density and the solute excluded volume; the charge change is identical in the holo and apo phases by construction; and the cells are matched to within 0.13 percent (K103N) and 0.31 percent (G190E) in volume, with DOR occupying 0.019 percent of the cell. Taking a per-phase correction of 1 kcal/mol, about 25 times the leading term we compute, the residual on the binding free energy is at most 0.003 kcal/mol, two to three orders of magnitude below the 0.2 to 1.2 kcal/mol per-leg statistical uncertainties in Table 2. The conclusion does not depend on the assumed magnitude.</w:t>
       </w:r>
     </w:p>
     <w:p>

</xml_diff>

<commit_message>
Resolve the last reviewer item: AM1-BCC charge-model comparison (R2.5)
Every [PENDING] marker in the response is now answered, and all 12 reviewer
points are addressed.

The comparison rests on 8 of 9 replicates; Y188L rep3 is re-running
single-threaded after the OS killed it under four-worker memory pressure. The
response and SI say so rather than implying a complete set. The conclusion does
not depend on it: ddE_Total shifts by at most 0.81 kcal/mol between charge
models with signs preserved, and the shift falls on the charge-dependent
components while ddE_vdW barely moves.

Number verification still 20/20 consistent.

Co-Authored-By: Claude Opus 5 <noreply@anthropic.com>
</commit_message>
<xml_diff>
--- a/revisions/Response-to-Reviewers.docx
+++ b/revisions/Response-to-Reviewers.docx
@@ -866,11 +866,9 @@
       </w:pPr>
       <w:r>
         <w:rPr>
-          <w:b/>
-          <w:bCs/>
-          <w:color w:val="FF0000"/>
-        </w:rPr>
-        <w:t xml:space="preserve">[PENDING — AM1-BCC MM/GBSA recomputation for a genotype subset. Insert the comparison.]</w:t>
+          <w:color w:val="FF0000"/>
+        </w:rPr>
+        <w:t xml:space="preserve">We have now done the recomputation as well as the discussion. The same trajectories were re-scored with AM1-BCC charges under an otherwise identical protocol, so the only difference between the two sets of numbers is the ligand charge model. First, the charge sets themselves differ substantially: both are neutral overall and correlate at 0.890, but AM1-BCC is markedly more polarised, with a mean absolute charge of 0.228 e against 0.138 e, an RMS difference of 0.165 e and a maximum of 0.390 e, concentrated on the carbonyl and amide atoms of the triazolinone and pyridinone that Gasteiger under-polarises. Second, that difference propagates to the absolute energies exactly as expected, moving them by 3.5 to 4.6 kcal/mol. Third, and this is the point for the manuscript, it does not propagate to the WT-referenced quantity that Table 2 reports: ddE_Total shifts by at most 0.81 kcal/mol (V106A from 1.73 to 2.54, Y188L from 2.78 to 2.46) and the sign is preserved for both genotypes. The component breakdown confirms the mechanism rather than leaving it as an assertion — the charge-dependent terms move most, ddE_elec by up to 1.20 and ddE_GB by up to 1.32 kcal/mol, while ddE_vdW, which does not depend on the charges at all, moves only 0.27 to 0.29. Much of the charge-model effect is therefore common to wild type and mutant and cancels in the difference. We note the scope honestly: this covers WT, V106A and Y188L, three replicates each except Y188L where one replicate is still computing at the time of writing, and it addresses MM/GBSA only. ddG_bind is unaffected by construction, since DOR is neutral and carries identical parameters at both end states of every alchemical leg.</w:t>
       </w:r>
     </w:p>
     <w:p>

</xml_diff>